<commit_message>
docs: AI 供应商说明补充 DeepSeek
</commit_message>
<xml_diff>
--- a/docs/习得-结项报告.docx
+++ b/docs/习得-结项报告.docx
@@ -202,7 +202,7 @@
           <w:color w:val="18191C"/>
           <w:sz w:val="20"/>
         </w:rPr>
-        <w:t>华为云 ECS/HTTPS、RDS、Redis、OBS、MaaS 真实资源未接；</w:t>
+        <w:t>华为云 ECS/HTTPS、RDS、Redis、OBS 真实资源未接；AI 模型可用 DeepSeek 或华为 MaaS。</w:t>
       </w:r>
     </w:p>
     <w:p>
@@ -1691,7 +1691,7 @@
                 <w:color w:val="18191C"/>
                 <w:sz w:val="18"/>
               </w:rPr>
-              <w:t>MaaS</w:t>
+              <w:t>AI 模型</w:t>
             </w:r>
           </w:p>
         </w:tc>
@@ -1711,7 +1711,7 @@
                 <w:color w:val="18191C"/>
                 <w:sz w:val="18"/>
               </w:rPr>
-              <w:t>Base URL + 模型 + Key，在 /admin/ai 填</w:t>
+              <w:t>任意 OpenAI 兼容（DeepSeek / 华为 MaaS）的 Base URL + 模型 + Key，在 /admin/ai 填</w:t>
             </w:r>
           </w:p>
         </w:tc>
@@ -2034,7 +2034,7 @@
           <w:color w:val="18191C"/>
           <w:sz w:val="20"/>
         </w:rPr>
-        <w:t>未配 MaaS Key 时，接棒排序仍是规则 + 反馈权重，AI 重排不生效。</w:t>
+        <w:t>未配 AI Key（DeepSeek / 华为 MaaS 均可）时，接棒排序仍是规则 + 反馈权重，AI 重排不生效。</w:t>
       </w:r>
     </w:p>
     <w:p/>
@@ -2064,7 +2064,7 @@
           <w:color w:val="18191C"/>
           <w:sz w:val="20"/>
         </w:rPr>
-        <w:t>在 /admin/ai 填 MaaS Base URL、模型、Key，点测试；</w:t>
+        <w:t>在 /admin/ai 填 DeepSeek（或华为 MaaS）的 Base URL、模型、Key，点测试；</w:t>
       </w:r>
     </w:p>
     <w:p>

</xml_diff>